<commit_message>
Integração final do compilador, otimizações TAC, bateria de testes e relatório
</commit_message>
<xml_diff>
--- a/relatório melhorias efolioA.docx
+++ b/relatório melhorias efolioA.docx
@@ -3,7 +3,119 @@
 <w:document xmlns:wpc="http://schemas.microsoft.com/office/word/2010/wordprocessingCanvas" xmlns:cx="http://schemas.microsoft.com/office/drawing/2014/chartex" xmlns:cx1="http://schemas.microsoft.com/office/drawing/2015/9/8/chartex" xmlns:cx2="http://schemas.microsoft.com/office/drawing/2015/10/21/chartex" xmlns:cx3="http://schemas.microsoft.com/office/drawing/2016/5/9/chartex" xmlns:cx4="http://schemas.microsoft.com/office/drawing/2016/5/10/chartex" xmlns:cx5="http://schemas.microsoft.com/office/drawing/2016/5/11/chartex" xmlns:cx6="http://schemas.microsoft.com/office/drawing/2016/5/12/chartex" xmlns:cx7="http://schemas.microsoft.com/office/drawing/2016/5/13/chartex" xmlns:cx8="http://schemas.microsoft.com/office/drawing/2016/5/14/chartex" xmlns:mc="http://schemas.openxmlformats.org/markup-compatibility/2006" xmlns:aink="http://schemas.microsoft.com/office/drawing/2016/ink" xmlns:am3d="http://schemas.microsoft.com/office/drawing/2017/model3d" xmlns:o="urn:schemas-microsoft-com:office:office" xmlns:oel="http://schemas.microsoft.com/office/2019/extlst" xmlns:r="http://schemas.openxmlformats.org/officeDocument/2006/relationships" xmlns:m="http://schemas.openxmlformats.org/officeDocument/2006/math" xmlns:v="urn:schemas-microsoft-com:vml" xmlns:wp14="http://schemas.microsoft.com/office/word/2010/wordprocessingDrawing" xmlns:wp="http://schemas.openxmlformats.org/drawingml/2006/wordprocessingDrawing" xmlns:w10="urn:schemas-microsoft-com:office:word" xmlns:w="http://schemas.openxmlformats.org/wordprocessingml/2006/main" xmlns:w14="http://schemas.microsoft.com/office/word/2010/wordml" xmlns:w15="http://schemas.microsoft.com/office/word/2012/wordml" xmlns:w16cex="http://schemas.microsoft.com/office/word/2018/wordml/cex" xmlns:w16cid="http://schemas.microsoft.com/office/word/2016/wordml/cid" xmlns:w16="http://schemas.microsoft.com/office/word/2018/wordml" xmlns:w16du="http://schemas.microsoft.com/office/word/2023/wordml/word16du" xmlns:w16sdtdh="http://schemas.microsoft.com/office/word/2020/wordml/sdtdatahash" xmlns:w16sdtfl="http://schemas.microsoft.com/office/word/2024/wordml/sdtformatlock" xmlns:w16se="http://schemas.microsoft.com/office/word/2015/wordml/symex" xmlns:wpg="http://schemas.microsoft.com/office/word/2010/wordprocessingGroup" xmlns:wpi="http://schemas.microsoft.com/office/word/2010/wordprocessingInk" xmlns:wne="http://schemas.microsoft.com/office/word/2006/wordml" xmlns:wps="http://schemas.microsoft.com/office/word/2010/wordprocessingShape" mc:Ignorable="w14 w15 w16se w16cid w16 w16cex w16sdtdh w16sdtfl w16du wp14">
   <w:body>
     <w:p>
-      <w:pPr>
+      <w:r>
+        <w:rPr>
+          <w:noProof/>
+          <w:lang w:eastAsia="pt-PT"/>
+        </w:rPr>
+        <w:drawing>
+          <wp:inline distT="0" distB="0" distL="0" distR="0" wp14:anchorId="528816A7" wp14:editId="49D9EAF2">
+            <wp:extent cx="5400040" cy="1293495"/>
+            <wp:effectExtent l="0" t="0" r="0" b="1905"/>
+            <wp:docPr id="1" name="Imagem 1" descr="E-fólio B: Folha de resolução para E-fólio. Universidade Aberta"/>
+            <wp:cNvGraphicFramePr>
+              <a:graphicFrameLocks xmlns:a="http://schemas.openxmlformats.org/drawingml/2006/main" noChangeAspect="1"/>
+            </wp:cNvGraphicFramePr>
+            <a:graphic xmlns:a="http://schemas.openxmlformats.org/drawingml/2006/main">
+              <a:graphicData uri="http://schemas.openxmlformats.org/drawingml/2006/picture">
+                <pic:pic xmlns:pic="http://schemas.openxmlformats.org/drawingml/2006/picture">
+                  <pic:nvPicPr>
+                    <pic:cNvPr id="1" name="efolio_b_res.gif"/>
+                    <pic:cNvPicPr/>
+                  </pic:nvPicPr>
+                  <pic:blipFill>
+                    <a:blip r:embed="rId5">
+                      <a:extLst>
+                        <a:ext uri="{28A0092B-C50C-407E-A947-70E740481C1C}">
+                          <a14:useLocalDpi xmlns:a14="http://schemas.microsoft.com/office/drawing/2010/main" val="0"/>
+                        </a:ext>
+                      </a:extLst>
+                    </a:blip>
+                    <a:stretch>
+                      <a:fillRect/>
+                    </a:stretch>
+                  </pic:blipFill>
+                  <pic:spPr>
+                    <a:xfrm>
+                      <a:off x="0" y="0"/>
+                      <a:ext cx="5400040" cy="1293495"/>
+                    </a:xfrm>
+                    <a:prstGeom prst="rect">
+                      <a:avLst/>
+                    </a:prstGeom>
+                  </pic:spPr>
+                </pic:pic>
+              </a:graphicData>
+            </a:graphic>
+          </wp:inline>
+        </w:drawing>
+      </w:r>
+    </w:p>
+    <w:p>
+      <w:r>
+        <w:rPr>
+          <w:rStyle w:val="Forte"/>
+        </w:rPr>
+        <w:t>U</w:t>
+      </w:r>
+      <w:r>
+        <w:rPr>
+          <w:rStyle w:val="Forte"/>
+        </w:rPr>
+        <w:t>NIDADE CURRICULAR:</w:t>
+      </w:r>
+      <w:r>
+        <w:t xml:space="preserve"> Compilação</w:t>
+      </w:r>
+    </w:p>
+    <w:p>
+      <w:r>
+        <w:rPr>
+          <w:rStyle w:val="Forte"/>
+        </w:rPr>
+        <w:t>CÓDIGO</w:t>
+      </w:r>
+      <w:r>
+        <w:rPr>
+          <w:rStyle w:val="Forte"/>
+        </w:rPr>
+        <w:t>:</w:t>
+      </w:r>
+      <w:r>
+        <w:t xml:space="preserve"> </w:t>
+      </w:r>
+      <w:r>
+        <w:rPr>
+          <w:rFonts w:cs="Arial"/>
+        </w:rPr>
+        <w:t>21018</w:t>
+      </w:r>
+    </w:p>
+    <w:p>
+      <w:r>
+        <w:rPr>
+          <w:rStyle w:val="Forte"/>
+        </w:rPr>
+        <w:t>DOCENTE</w:t>
+      </w:r>
+      <w:r>
+        <w:rPr>
+          <w:rStyle w:val="Forte"/>
+        </w:rPr>
+        <w:t>:</w:t>
+      </w:r>
+      <w:r>
+        <w:t xml:space="preserve"> Constantino e </w:t>
+      </w:r>
+      <w:proofErr w:type="spellStart"/>
+      <w:r>
+        <w:t>Rudi</w:t>
+      </w:r>
+      <w:proofErr w:type="spellEnd"/>
+    </w:p>
+    <w:p>
+      <w:pPr>
+        <w:spacing w:after="240" w:line="360" w:lineRule="auto"/>
         <w:rPr>
           <w:b/>
           <w:bCs/>
@@ -14,11 +126,12 @@
           <w:b/>
           <w:bCs/>
         </w:rPr>
-        <w:t>Relatório de Melhorias ao E-Fólio A</w:t>
-      </w:r>
-    </w:p>
-    <w:p>
-      <w:pPr>
+        <w:t>Grupo: DUALCORE</w:t>
+      </w:r>
+    </w:p>
+    <w:p>
+      <w:pPr>
+        <w:spacing w:after="240" w:line="360" w:lineRule="auto"/>
         <w:rPr>
           <w:b/>
           <w:bCs/>
@@ -29,131 +142,439 @@
           <w:b/>
           <w:bCs/>
         </w:rPr>
-        <w:t>UC 21018 — Compilação</w:t>
-      </w:r>
-    </w:p>
-    <w:p>
+        <w:t>João Rodrigues (2203474)</w:t>
+      </w:r>
+    </w:p>
+    <w:p>
+      <w:pPr>
+        <w:rPr>
+          <w:rStyle w:val="Forte"/>
+        </w:rPr>
+      </w:pPr>
       <w:r>
         <w:rPr>
           <w:b/>
           <w:bCs/>
         </w:rPr>
-        <w:t>Grupo:</w:t>
-      </w:r>
-      <w:r>
-        <w:t xml:space="preserve"> QUADCORE</w:t>
-      </w:r>
-      <w:r>
-        <w:br/>
-      </w:r>
-      <w:r>
+        <w:t>Maria Costa (2304361)</w:t>
+      </w:r>
+    </w:p>
+    <w:p>
+      <w:r>
+        <w:rPr>
+          <w:rStyle w:val="Forte"/>
+        </w:rPr>
+        <w:t>CURSO:</w:t>
+      </w:r>
+      <w:r>
+        <w:t xml:space="preserve"> </w:t>
+      </w:r>
+      <w:r>
+        <w:t>Licenciatura em Engenharia Informática</w:t>
+      </w:r>
+    </w:p>
+    <w:p>
+      <w:r>
+        <w:rPr>
+          <w:rStyle w:val="Forte"/>
+        </w:rPr>
+        <w:t>DATA DE ENTREGA:</w:t>
+      </w:r>
+      <w:r>
+        <w:t xml:space="preserve"> </w:t>
+      </w:r>
+      <w:r>
+        <w:t>05/2026</w:t>
+      </w:r>
+    </w:p>
+    <w:p>
+      <w:pPr>
+        <w:spacing w:after="0" w:line="240" w:lineRule="auto"/>
+      </w:pPr>
+    </w:p>
+    <w:p>
+      <w:pPr>
+        <w:spacing w:after="0" w:line="240" w:lineRule="auto"/>
+      </w:pPr>
+    </w:p>
+    <w:p>
+      <w:pPr>
+        <w:spacing w:after="0" w:line="240" w:lineRule="auto"/>
+      </w:pPr>
+    </w:p>
+    <w:p>
+      <w:pPr>
+        <w:spacing w:after="0" w:line="240" w:lineRule="auto"/>
+      </w:pPr>
+    </w:p>
+    <w:p>
+      <w:pPr>
+        <w:spacing w:after="0" w:line="240" w:lineRule="auto"/>
+      </w:pPr>
+    </w:p>
+    <w:p>
+      <w:pPr>
+        <w:rPr>
+          <w:rFonts w:ascii="Segoe UI" w:eastAsiaTheme="majorEastAsia" w:hAnsi="Segoe UI" w:cs="Segoe UI"/>
+          <w:color w:val="1D2125"/>
+          <w:sz w:val="48"/>
+          <w:szCs w:val="48"/>
+          <w:lang w:eastAsia="pt-PT"/>
+        </w:rPr>
+      </w:pPr>
+      <w:r>
+        <w:rPr>
+          <w:rFonts w:ascii="Segoe UI" w:eastAsiaTheme="majorEastAsia" w:hAnsi="Segoe UI" w:cs="Segoe UI"/>
+          <w:color w:val="1D2125"/>
+          <w:sz w:val="48"/>
+          <w:szCs w:val="48"/>
+          <w:lang w:eastAsia="pt-PT"/>
+        </w:rPr>
+        <w:t>Relatório de Melhorias ao E-Fólio A</w:t>
+      </w:r>
+    </w:p>
+    <w:p>
+      <w:pPr>
+        <w:rPr>
+          <w:rFonts w:ascii="Segoe UI" w:eastAsiaTheme="majorEastAsia" w:hAnsi="Segoe UI" w:cs="Segoe UI"/>
+          <w:color w:val="1D2125"/>
+          <w:sz w:val="48"/>
+          <w:szCs w:val="48"/>
+          <w:lang w:eastAsia="pt-PT"/>
+        </w:rPr>
+      </w:pPr>
+    </w:p>
+    <w:p>
+      <w:pPr>
+        <w:rPr>
+          <w:rFonts w:ascii="Segoe UI" w:eastAsiaTheme="majorEastAsia" w:hAnsi="Segoe UI" w:cs="Segoe UI"/>
+          <w:color w:val="1D2125"/>
+          <w:sz w:val="48"/>
+          <w:szCs w:val="48"/>
+          <w:lang w:eastAsia="pt-PT"/>
+        </w:rPr>
+      </w:pPr>
+    </w:p>
+    <w:p>
+      <w:pPr>
+        <w:rPr>
+          <w:rFonts w:ascii="Segoe UI" w:eastAsiaTheme="majorEastAsia" w:hAnsi="Segoe UI" w:cs="Segoe UI"/>
+          <w:color w:val="1D2125"/>
+          <w:sz w:val="48"/>
+          <w:szCs w:val="48"/>
+          <w:lang w:eastAsia="pt-PT"/>
+        </w:rPr>
+      </w:pPr>
+    </w:p>
+    <w:p>
+      <w:pPr>
+        <w:rPr>
+          <w:rFonts w:ascii="Segoe UI" w:eastAsiaTheme="majorEastAsia" w:hAnsi="Segoe UI" w:cs="Segoe UI"/>
+          <w:color w:val="1D2125"/>
+          <w:sz w:val="48"/>
+          <w:szCs w:val="48"/>
+          <w:lang w:eastAsia="pt-PT"/>
+        </w:rPr>
+      </w:pPr>
+    </w:p>
+    <w:p>
+      <w:pPr>
+        <w:rPr>
+          <w:rFonts w:ascii="Segoe UI" w:eastAsiaTheme="majorEastAsia" w:hAnsi="Segoe UI" w:cs="Segoe UI"/>
+          <w:color w:val="1D2125"/>
+          <w:sz w:val="48"/>
+          <w:szCs w:val="48"/>
+          <w:lang w:eastAsia="pt-PT"/>
+        </w:rPr>
+      </w:pPr>
+    </w:p>
+    <w:p>
+      <w:pPr>
+        <w:rPr>
+          <w:rFonts w:ascii="Segoe UI" w:eastAsiaTheme="majorEastAsia" w:hAnsi="Segoe UI" w:cs="Segoe UI"/>
+          <w:color w:val="1D2125"/>
+          <w:sz w:val="48"/>
+          <w:szCs w:val="48"/>
+          <w:lang w:eastAsia="pt-PT"/>
+        </w:rPr>
+      </w:pPr>
+    </w:p>
+    <w:p>
+      <w:pPr>
         <w:rPr>
           <w:b/>
           <w:bCs/>
         </w:rPr>
-        <w:t>Estudantes:</w:t>
-      </w:r>
-      <w:r>
-        <w:t xml:space="preserve"> Maria Costa, João Rodrigues, [nome], [nome]</w:t>
-      </w:r>
-      <w:r>
-        <w:br/>
-      </w:r>
-      <w:r>
-        <w:rPr>
+      </w:pPr>
+    </w:p>
+    <w:p>
+      <w:pPr>
+        <w:pStyle w:val="Ttulo1"/>
+        <w:spacing w:before="0" w:after="480" w:line="240" w:lineRule="auto"/>
+        <w:rPr>
+          <w:rFonts w:ascii="Arial Black" w:eastAsia="Times New Roman" w:hAnsi="Arial Black" w:cs="Times New Roman"/>
           <w:b/>
           <w:bCs/>
-        </w:rPr>
-        <w:t>Ano letivo:</w:t>
-      </w:r>
-      <w:r>
-        <w:t xml:space="preserve"> 2025/2026</w:t>
-      </w:r>
-    </w:p>
-    <w:p>
-      <w:pPr>
-        <w:rPr>
+          <w:caps/>
+          <w:color w:val="2C7FCE" w:themeColor="text2" w:themeTint="99"/>
+          <w:kern w:val="0"/>
+          <w:sz w:val="36"/>
+          <w:szCs w:val="28"/>
+          <w14:ligatures w14:val="none"/>
+        </w:rPr>
+      </w:pPr>
+      <w:r>
+        <w:rPr>
+          <w:rFonts w:ascii="Arial Black" w:eastAsia="Times New Roman" w:hAnsi="Arial Black" w:cs="Times New Roman"/>
           <w:b/>
           <w:bCs/>
-        </w:rPr>
-      </w:pPr>
-      <w:r>
-        <w:rPr>
+          <w:caps/>
+          <w:color w:val="2C7FCE" w:themeColor="text2" w:themeTint="99"/>
+          <w:kern w:val="0"/>
+          <w:sz w:val="36"/>
+          <w:szCs w:val="28"/>
+          <w14:ligatures w14:val="none"/>
+        </w:rPr>
+        <w:lastRenderedPageBreak/>
+        <w:t>1. Introdução</w:t>
+      </w:r>
+    </w:p>
+    <w:p>
+      <w:r>
+        <w:t>No âmbito da preparação do E-Fólio B, foi revista a implementação desenvolvida no E-Fólio A, tendo em consideração os comentários de avaliação recebidos. O objetivo desta revisão foi melhorar a robustez da análise léxica e sintática da linguagem MOCP, corrigindo limitações identificadas e preparando uma base mais sólida para as fases seguintes: ações semânticas, geração de código intermédio e otimização.</w:t>
+      </w:r>
+    </w:p>
+    <w:p/>
+    <w:p>
+      <w:pPr>
+        <w:pStyle w:val="Ttulo1"/>
+        <w:spacing w:before="0" w:after="480" w:line="240" w:lineRule="auto"/>
+        <w:rPr>
+          <w:rFonts w:ascii="Arial Black" w:eastAsia="Times New Roman" w:hAnsi="Arial Black" w:cs="Times New Roman"/>
           <w:b/>
           <w:bCs/>
-        </w:rPr>
-        <w:t>1. Introdução</w:t>
-      </w:r>
-    </w:p>
-    <w:p>
-      <w:r>
-        <w:t>No âmbito da preparação do E-Fólio B, foi revista a implementação desenvolvida no E-Fólio A, tendo em consideração os comentários de avaliação recebidos. O objetivo desta revisão foi melhorar a robustez da análise léxica e sintática da linguagem MOCP, corrigindo limitações identificadas e preparando uma base mais sólida para as fases seguintes: ações semânticas, geração de código intermédio e otimização.</w:t>
-      </w:r>
-    </w:p>
-    <w:p>
-      <w:pPr>
-        <w:rPr>
+          <w:caps/>
+          <w:color w:val="2C7FCE" w:themeColor="text2" w:themeTint="99"/>
+          <w:kern w:val="0"/>
+          <w:sz w:val="36"/>
+          <w:szCs w:val="28"/>
+          <w14:ligatures w14:val="none"/>
+        </w:rPr>
+      </w:pPr>
+      <w:r>
+        <w:rPr>
+          <w:rFonts w:ascii="Arial Black" w:eastAsia="Times New Roman" w:hAnsi="Arial Black" w:cs="Times New Roman"/>
           <w:b/>
           <w:bCs/>
-        </w:rPr>
-      </w:pPr>
-      <w:r>
-        <w:rPr>
+          <w:caps/>
+          <w:color w:val="2C7FCE" w:themeColor="text2" w:themeTint="99"/>
+          <w:kern w:val="0"/>
+          <w:sz w:val="36"/>
+          <w:szCs w:val="28"/>
+          <w14:ligatures w14:val="none"/>
+        </w:rPr>
+        <w:t>2. Melhorias na análise léxica</w:t>
+      </w:r>
+    </w:p>
+    <w:p>
+      <w:r>
+        <w:t xml:space="preserve">A primeira melhoria consistiu na introdução de uma regra “apanha-tudo” no </w:t>
+      </w:r>
+      <w:proofErr w:type="spellStart"/>
+      <w:r>
+        <w:t>lexer</w:t>
+      </w:r>
+      <w:proofErr w:type="spellEnd"/>
+      <w:r>
+        <w:t>:</w:t>
+      </w:r>
+    </w:p>
+    <w:p>
+      <w:r>
+        <w:t>ERROR_</w:t>
+      </w:r>
+      <w:proofErr w:type="gramStart"/>
+      <w:r>
+        <w:t>CHAR :</w:t>
+      </w:r>
+      <w:proofErr w:type="gramEnd"/>
+      <w:r>
+        <w:t xml:space="preserve"> </w:t>
+      </w:r>
+      <w:proofErr w:type="gramStart"/>
+      <w:r>
+        <w:t>. ;</w:t>
+      </w:r>
+      <w:proofErr w:type="gramEnd"/>
+    </w:p>
+    <w:p>
+      <w:r>
+        <w:t>Esta regra permite capturar explicitamente caracteres inválidos ou inesperados que não correspondam a nenhuma regra lexical da linguagem. Com esta alteração, símbolos como @ passam a gerar mensagens controladas, por exemplo:</w:t>
+      </w:r>
+    </w:p>
+    <w:p>
+      <w:r>
+        <w:t>[LÉXICO] linha 29, coluna 16: carácter inesperado '@'.</w:t>
+      </w:r>
+    </w:p>
+    <w:p>
+      <w:r>
+        <w:t>Foi também acrescentada a regra:</w:t>
+      </w:r>
+    </w:p>
+    <w:p>
+      <w:r>
+        <w:t>UNCLOSED_STRING</w:t>
+      </w:r>
+      <w:r>
+        <w:br/>
+        <w:t xml:space="preserve">  </w:t>
+      </w:r>
+      <w:proofErr w:type="gramStart"/>
+      <w:r>
+        <w:t xml:space="preserve">  :</w:t>
+      </w:r>
+      <w:proofErr w:type="gramEnd"/>
+      <w:r>
+        <w:t xml:space="preserve"> '"' (ESC_SEQ | ~["\\\r\n</w:t>
+      </w:r>
+      <w:proofErr w:type="gramStart"/>
+      <w:r>
+        <w:t>])*</w:t>
+      </w:r>
+      <w:proofErr w:type="gramEnd"/>
+      <w:r>
+        <w:br/>
+        <w:t xml:space="preserve">  </w:t>
+      </w:r>
+      <w:proofErr w:type="gramStart"/>
+      <w:r>
+        <w:t xml:space="preserve">  ;</w:t>
+      </w:r>
+      <w:proofErr w:type="gramEnd"/>
+    </w:p>
+    <w:p>
+      <w:r>
+        <w:t xml:space="preserve">Esta regra permite detetar </w:t>
+      </w:r>
+      <w:proofErr w:type="spellStart"/>
+      <w:r>
+        <w:t>strings</w:t>
+      </w:r>
+      <w:proofErr w:type="spellEnd"/>
+      <w:r>
+        <w:t xml:space="preserve"> não terminadas, evitando mensagens genéricas do ANTLR e produzindo uma mensagem mais clara:</w:t>
+      </w:r>
+    </w:p>
+    <w:p>
+      <w:r>
+        <w:t xml:space="preserve">[LÉXICO] linha 36, coluna 14: </w:t>
+      </w:r>
+      <w:proofErr w:type="spellStart"/>
+      <w:r>
+        <w:t>string</w:t>
+      </w:r>
+      <w:proofErr w:type="spellEnd"/>
+      <w:r>
+        <w:t xml:space="preserve"> não terminada.</w:t>
+      </w:r>
+    </w:p>
+    <w:p>
+      <w:r>
+        <w:t>Estas alterações tornam o feedback do compilador mais útil para depuração e validação.</w:t>
+      </w:r>
+    </w:p>
+    <w:p/>
+    <w:p>
+      <w:pPr>
+        <w:pStyle w:val="Ttulo1"/>
+        <w:spacing w:before="0" w:after="480" w:line="240" w:lineRule="auto"/>
+        <w:rPr>
+          <w:rFonts w:ascii="Arial Black" w:eastAsia="Times New Roman" w:hAnsi="Arial Black" w:cs="Times New Roman"/>
           <w:b/>
           <w:bCs/>
-        </w:rPr>
-        <w:t>2. Melhorias na análise léxica</w:t>
-      </w:r>
-    </w:p>
-    <w:p>
-      <w:r>
-        <w:t xml:space="preserve">A primeira melhoria consistiu na introdução de uma regra “apanha-tudo” no </w:t>
-      </w:r>
+          <w:caps/>
+          <w:color w:val="2C7FCE" w:themeColor="text2" w:themeTint="99"/>
+          <w:kern w:val="0"/>
+          <w:sz w:val="36"/>
+          <w:szCs w:val="28"/>
+          <w14:ligatures w14:val="none"/>
+        </w:rPr>
+      </w:pPr>
+      <w:r>
+        <w:rPr>
+          <w:rFonts w:ascii="Arial Black" w:eastAsia="Times New Roman" w:hAnsi="Arial Black" w:cs="Times New Roman"/>
+          <w:b/>
+          <w:bCs/>
+          <w:caps/>
+          <w:color w:val="2C7FCE" w:themeColor="text2" w:themeTint="99"/>
+          <w:kern w:val="0"/>
+          <w:sz w:val="36"/>
+          <w:szCs w:val="28"/>
+          <w14:ligatures w14:val="none"/>
+        </w:rPr>
+        <w:t>3. Melhoria dos literais reais</w:t>
+      </w:r>
+    </w:p>
+    <w:p>
+      <w:r>
+        <w:t>A regra inicial dos literais reais aceitava apenas valores no formato estrito:</w:t>
+      </w:r>
+    </w:p>
+    <w:p>
+      <w:r>
+        <w:t>[0-</w:t>
+      </w:r>
+      <w:proofErr w:type="gramStart"/>
+      <w:r>
+        <w:t>9]+</w:t>
+      </w:r>
+      <w:proofErr w:type="gramEnd"/>
+      <w:r>
+        <w:t xml:space="preserve"> '.' [0-</w:t>
+      </w:r>
+      <w:proofErr w:type="gramStart"/>
+      <w:r>
+        <w:t>9]+</w:t>
+      </w:r>
+      <w:proofErr w:type="gramEnd"/>
+    </w:p>
+    <w:p>
+      <w:r>
+        <w:t>Assim, valores como 3. e .5 não eram reconhecidos como literais reais. Para tornar a gramática mais abrangente, a regra foi alterada para:</w:t>
+      </w:r>
+    </w:p>
+    <w:p>
       <w:proofErr w:type="spellStart"/>
       <w:r>
-        <w:t>lexer</w:t>
+        <w:t>fragment</w:t>
       </w:r>
       <w:proofErr w:type="spellEnd"/>
       <w:r>
-        <w:t>:</w:t>
-      </w:r>
-    </w:p>
-    <w:p>
-      <w:r>
-        <w:t>ERROR_</w:t>
+        <w:t xml:space="preserve"> </w:t>
       </w:r>
       <w:proofErr w:type="gramStart"/>
       <w:r>
-        <w:t>CHAR :</w:t>
+        <w:t>DIGITS :</w:t>
       </w:r>
       <w:proofErr w:type="gramEnd"/>
       <w:r>
-        <w:t xml:space="preserve"> </w:t>
+        <w:t xml:space="preserve"> [0-</w:t>
       </w:r>
       <w:proofErr w:type="gramStart"/>
       <w:r>
-        <w:t>. ;</w:t>
+        <w:t>9]+</w:t>
       </w:r>
       <w:proofErr w:type="gramEnd"/>
-    </w:p>
-    <w:p>
-      <w:r>
-        <w:t>Esta regra permite capturar explicitamente caracteres inválidos ou inesperados que não correspondam a nenhuma regra lexical da linguagem. Com esta alteração, símbolos como @ passam a gerar mensagens controladas, por exemplo:</w:t>
-      </w:r>
-    </w:p>
-    <w:p>
-      <w:r>
-        <w:t>[LÉXICO] linha 29, coluna 16: carácter inesperado '@'.</w:t>
-      </w:r>
-    </w:p>
-    <w:p>
-      <w:r>
-        <w:t>Foi também acrescentada a regra:</w:t>
-      </w:r>
-    </w:p>
-    <w:p>
-      <w:r>
-        <w:t>UNCLOSED_STRING</w:t>
+      <w:r>
+        <w:t xml:space="preserve"> ;</w:t>
+      </w:r>
+      <w:r>
+        <w:br/>
+      </w:r>
+      <w:r>
+        <w:br/>
+        <w:t>REAL_LITERAL</w:t>
       </w:r>
       <w:r>
         <w:br/>
@@ -165,13 +586,15 @@
       </w:r>
       <w:proofErr w:type="gramEnd"/>
       <w:r>
-        <w:t xml:space="preserve"> '"' (ESC_SEQ | ~["\\\r\n</w:t>
-      </w:r>
-      <w:proofErr w:type="gramStart"/>
-      <w:r>
-        <w:t>])*</w:t>
-      </w:r>
-      <w:proofErr w:type="gramEnd"/>
+        <w:t xml:space="preserve"> DIGITS '.' DIGITS?</w:t>
+      </w:r>
+      <w:r>
+        <w:br/>
+      </w:r>
+      <w:r>
+        <w:lastRenderedPageBreak/>
+        <w:t xml:space="preserve">    | '.' DIGITS</w:t>
+      </w:r>
       <w:r>
         <w:br/>
         <w:t xml:space="preserve">  </w:t>
@@ -181,202 +604,86 @@
         <w:t xml:space="preserve">  ;</w:t>
       </w:r>
       <w:proofErr w:type="gramEnd"/>
-    </w:p>
-    <w:p>
-      <w:r>
-        <w:t xml:space="preserve">Esta regra permite detetar </w:t>
-      </w:r>
-      <w:proofErr w:type="spellStart"/>
-      <w:r>
-        <w:t>strings</w:t>
-      </w:r>
-      <w:proofErr w:type="spellEnd"/>
-      <w:r>
-        <w:t xml:space="preserve"> não terminadas, evitando mensagens genéricas do ANTLR e produzindo uma mensagem mais clara:</w:t>
-      </w:r>
-    </w:p>
-    <w:p>
-      <w:r>
-        <w:t xml:space="preserve">[LÉXICO] linha 36, coluna 14: </w:t>
-      </w:r>
-      <w:proofErr w:type="spellStart"/>
-      <w:r>
-        <w:t>string</w:t>
-      </w:r>
-      <w:proofErr w:type="spellEnd"/>
-      <w:r>
-        <w:t xml:space="preserve"> não terminada.</w:t>
-      </w:r>
-    </w:p>
-    <w:p>
-      <w:r>
-        <w:t>Estas alterações tornam o feedback do compilador mais útil para depuração e validação.</w:t>
-      </w:r>
-    </w:p>
-    <w:p>
-      <w:pPr>
-        <w:rPr>
+      <w:r>
+        <w:br/>
+      </w:r>
+      <w:r>
+        <w:br/>
+        <w:t>INT_LITERAL</w:t>
+      </w:r>
+      <w:r>
+        <w:br/>
+        <w:t xml:space="preserve">  </w:t>
+      </w:r>
+      <w:proofErr w:type="gramStart"/>
+      <w:r>
+        <w:t xml:space="preserve">  :</w:t>
+      </w:r>
+      <w:proofErr w:type="gramEnd"/>
+      <w:r>
+        <w:t xml:space="preserve"> DIGITS</w:t>
+      </w:r>
+      <w:r>
+        <w:br/>
+        <w:t xml:space="preserve">  </w:t>
+      </w:r>
+      <w:proofErr w:type="gramStart"/>
+      <w:r>
+        <w:t xml:space="preserve">  ;</w:t>
+      </w:r>
+      <w:proofErr w:type="gramEnd"/>
+    </w:p>
+    <w:p>
+      <w:r>
+        <w:t>Com esta alteração, a linguagem passa a aceitar corretamente os formatos:</w:t>
+      </w:r>
+    </w:p>
+    <w:p>
+      <w:r>
+        <w:t>3.14</w:t>
+      </w:r>
+      <w:r>
+        <w:br/>
+        <w:t>3.</w:t>
+      </w:r>
+      <w:r>
+        <w:br/>
+        <w:t>.5</w:t>
+      </w:r>
+    </w:p>
+    <w:p>
+      <w:r>
+        <w:t>Esta decisão aumenta a compatibilidade com formas comuns de escrita de literais reais em linguagens de estilo C.</w:t>
+      </w:r>
+    </w:p>
+    <w:p/>
+    <w:p>
+      <w:pPr>
+        <w:pStyle w:val="Ttulo1"/>
+        <w:spacing w:before="0" w:after="480" w:line="240" w:lineRule="auto"/>
+        <w:rPr>
+          <w:rFonts w:ascii="Arial Black" w:eastAsia="Times New Roman" w:hAnsi="Arial Black" w:cs="Times New Roman"/>
           <w:b/>
           <w:bCs/>
-        </w:rPr>
-      </w:pPr>
-      <w:r>
-        <w:rPr>
+          <w:caps/>
+          <w:color w:val="2C7FCE" w:themeColor="text2" w:themeTint="99"/>
+          <w:kern w:val="0"/>
+          <w:sz w:val="36"/>
+          <w:szCs w:val="28"/>
+          <w14:ligatures w14:val="none"/>
+        </w:rPr>
+      </w:pPr>
+      <w:r>
+        <w:rPr>
+          <w:rFonts w:ascii="Arial Black" w:eastAsia="Times New Roman" w:hAnsi="Arial Black" w:cs="Times New Roman"/>
           <w:b/>
           <w:bCs/>
-        </w:rPr>
-        <w:t>3. Melhoria dos literais reais</w:t>
-      </w:r>
-    </w:p>
-    <w:p>
-      <w:r>
-        <w:t>A regra inicial dos literais reais aceitava apenas valores no formato estrito:</w:t>
-      </w:r>
-    </w:p>
-    <w:p>
-      <w:r>
-        <w:t>[0-</w:t>
-      </w:r>
-      <w:proofErr w:type="gramStart"/>
-      <w:r>
-        <w:t>9]+</w:t>
-      </w:r>
-      <w:proofErr w:type="gramEnd"/>
-      <w:r>
-        <w:t xml:space="preserve"> '.' [0-</w:t>
-      </w:r>
-      <w:proofErr w:type="gramStart"/>
-      <w:r>
-        <w:t>9]+</w:t>
-      </w:r>
-      <w:proofErr w:type="gramEnd"/>
-    </w:p>
-    <w:p>
-      <w:r>
-        <w:t>Assim, valores como 3. e .5 não eram reconhecidos como literais reais. Para tornar a gramática mais abrangente, a regra foi alterada para:</w:t>
-      </w:r>
-    </w:p>
-    <w:p>
-      <w:proofErr w:type="spellStart"/>
-      <w:r>
-        <w:t>fragment</w:t>
-      </w:r>
-      <w:proofErr w:type="spellEnd"/>
-      <w:r>
-        <w:t xml:space="preserve"> </w:t>
-      </w:r>
-      <w:proofErr w:type="gramStart"/>
-      <w:r>
-        <w:t>DIGITS :</w:t>
-      </w:r>
-      <w:proofErr w:type="gramEnd"/>
-      <w:r>
-        <w:t xml:space="preserve"> [0-</w:t>
-      </w:r>
-      <w:proofErr w:type="gramStart"/>
-      <w:r>
-        <w:t>9]+</w:t>
-      </w:r>
-      <w:proofErr w:type="gramEnd"/>
-      <w:r>
-        <w:t xml:space="preserve"> ;</w:t>
-      </w:r>
-      <w:r>
-        <w:br/>
-      </w:r>
-      <w:r>
-        <w:br/>
-        <w:t>REAL_LITERAL</w:t>
-      </w:r>
-      <w:r>
-        <w:br/>
-        <w:t xml:space="preserve">  </w:t>
-      </w:r>
-      <w:proofErr w:type="gramStart"/>
-      <w:r>
-        <w:t xml:space="preserve">  :</w:t>
-      </w:r>
-      <w:proofErr w:type="gramEnd"/>
-      <w:r>
-        <w:t xml:space="preserve"> DIGITS '.' DIGITS?</w:t>
-      </w:r>
-      <w:r>
-        <w:br/>
-        <w:t xml:space="preserve">    | '.' DIGITS</w:t>
-      </w:r>
-      <w:r>
-        <w:br/>
-        <w:t xml:space="preserve">  </w:t>
-      </w:r>
-      <w:proofErr w:type="gramStart"/>
-      <w:r>
-        <w:t xml:space="preserve">  ;</w:t>
-      </w:r>
-      <w:proofErr w:type="gramEnd"/>
-      <w:r>
-        <w:br/>
-      </w:r>
-      <w:r>
-        <w:lastRenderedPageBreak/>
-        <w:br/>
-        <w:t>INT_LITERAL</w:t>
-      </w:r>
-      <w:r>
-        <w:br/>
-        <w:t xml:space="preserve">  </w:t>
-      </w:r>
-      <w:proofErr w:type="gramStart"/>
-      <w:r>
-        <w:t xml:space="preserve">  :</w:t>
-      </w:r>
-      <w:proofErr w:type="gramEnd"/>
-      <w:r>
-        <w:t xml:space="preserve"> DIGITS</w:t>
-      </w:r>
-      <w:r>
-        <w:br/>
-        <w:t xml:space="preserve">  </w:t>
-      </w:r>
-      <w:proofErr w:type="gramStart"/>
-      <w:r>
-        <w:t xml:space="preserve">  ;</w:t>
-      </w:r>
-      <w:proofErr w:type="gramEnd"/>
-    </w:p>
-    <w:p>
-      <w:r>
-        <w:t>Com esta alteração, a linguagem passa a aceitar corretamente os formatos:</w:t>
-      </w:r>
-    </w:p>
-    <w:p>
-      <w:r>
-        <w:t>3.14</w:t>
-      </w:r>
-      <w:r>
-        <w:br/>
-        <w:t>3.</w:t>
-      </w:r>
-      <w:r>
-        <w:br/>
-        <w:t>.5</w:t>
-      </w:r>
-    </w:p>
-    <w:p>
-      <w:r>
-        <w:t>Esta decisão aumenta a compatibilidade com formas comuns de escrita de literais reais em linguagens de estilo C.</w:t>
-      </w:r>
-    </w:p>
-    <w:p>
-      <w:pPr>
-        <w:rPr>
-          <w:b/>
-          <w:bCs/>
-        </w:rPr>
-      </w:pPr>
-      <w:r>
-        <w:rPr>
-          <w:b/>
-          <w:bCs/>
+          <w:caps/>
+          <w:color w:val="2C7FCE" w:themeColor="text2" w:themeTint="99"/>
+          <w:kern w:val="0"/>
+          <w:sz w:val="36"/>
+          <w:szCs w:val="28"/>
+          <w14:ligatures w14:val="none"/>
         </w:rPr>
         <w:t>4. Melhoria da regra principal do programa</w:t>
       </w:r>
@@ -529,16 +836,33 @@
     </w:p>
     <w:p>
       <w:pPr>
-        <w:rPr>
+        <w:pStyle w:val="Ttulo1"/>
+        <w:spacing w:before="0" w:after="480" w:line="240" w:lineRule="auto"/>
+        <w:rPr>
+          <w:rFonts w:ascii="Arial Black" w:eastAsia="Times New Roman" w:hAnsi="Arial Black" w:cs="Times New Roman"/>
           <w:b/>
           <w:bCs/>
-        </w:rPr>
-      </w:pPr>
-      <w:r>
-        <w:rPr>
+          <w:caps/>
+          <w:color w:val="2C7FCE" w:themeColor="text2" w:themeTint="99"/>
+          <w:kern w:val="0"/>
+          <w:sz w:val="36"/>
+          <w:szCs w:val="28"/>
+          <w14:ligatures w14:val="none"/>
+        </w:rPr>
+      </w:pPr>
+      <w:r>
+        <w:rPr>
+          <w:rFonts w:ascii="Arial Black" w:eastAsia="Times New Roman" w:hAnsi="Arial Black" w:cs="Times New Roman"/>
           <w:b/>
           <w:bCs/>
-        </w:rPr>
+          <w:caps/>
+          <w:color w:val="2C7FCE" w:themeColor="text2" w:themeTint="99"/>
+          <w:kern w:val="0"/>
+          <w:sz w:val="36"/>
+          <w:szCs w:val="28"/>
+          <w14:ligatures w14:val="none"/>
+        </w:rPr>
+        <w:lastRenderedPageBreak/>
         <w:t>5. Atualização do tratamento de erros</w:t>
       </w:r>
     </w:p>
@@ -600,17 +924,34 @@
         <w:t>, ++, -- e +=.</w:t>
       </w:r>
     </w:p>
-    <w:p>
-      <w:pPr>
-        <w:rPr>
+    <w:p/>
+    <w:p>
+      <w:pPr>
+        <w:pStyle w:val="Ttulo1"/>
+        <w:spacing w:before="0" w:after="480" w:line="240" w:lineRule="auto"/>
+        <w:rPr>
+          <w:rFonts w:ascii="Arial Black" w:eastAsia="Times New Roman" w:hAnsi="Arial Black" w:cs="Times New Roman"/>
           <w:b/>
           <w:bCs/>
-        </w:rPr>
-      </w:pPr>
-      <w:r>
-        <w:rPr>
+          <w:caps/>
+          <w:color w:val="2C7FCE" w:themeColor="text2" w:themeTint="99"/>
+          <w:kern w:val="0"/>
+          <w:sz w:val="36"/>
+          <w:szCs w:val="28"/>
+          <w14:ligatures w14:val="none"/>
+        </w:rPr>
+      </w:pPr>
+      <w:r>
+        <w:rPr>
+          <w:rFonts w:ascii="Arial Black" w:eastAsia="Times New Roman" w:hAnsi="Arial Black" w:cs="Times New Roman"/>
           <w:b/>
           <w:bCs/>
+          <w:caps/>
+          <w:color w:val="2C7FCE" w:themeColor="text2" w:themeTint="99"/>
+          <w:kern w:val="0"/>
+          <w:sz w:val="36"/>
+          <w:szCs w:val="28"/>
+          <w14:ligatures w14:val="none"/>
         </w:rPr>
         <w:t>6. Validação empírica das melhorias</w:t>
       </w:r>
@@ -651,7 +992,6 @@
         </w:numPr>
       </w:pPr>
       <w:r>
-        <w:lastRenderedPageBreak/>
         <w:t xml:space="preserve">deteção de caracteres inválidos; </w:t>
       </w:r>
     </w:p>
@@ -685,6 +1025,9 @@
         <w:br/>
       </w:r>
       <w:r>
+        <w:rPr>
+          <w:noProof/>
+        </w:rPr>
         <w:drawing>
           <wp:inline distT="0" distB="0" distL="0" distR="0" wp14:anchorId="74B60C9C" wp14:editId="070EB1A4">
             <wp:extent cx="3977985" cy="495343"/>
@@ -701,7 +1044,7 @@
                     <pic:cNvPicPr/>
                   </pic:nvPicPr>
                   <pic:blipFill>
-                    <a:blip r:embed="rId5"/>
+                    <a:blip r:embed="rId6"/>
                     <a:stretch>
                       <a:fillRect/>
                     </a:stretch>
@@ -727,17 +1070,34 @@
         <w:t>A ausência de erros nas declarações com 3., .5 e 3.14 confirma que os novos formatos de literais reais foram corretamente aceites.</w:t>
       </w:r>
     </w:p>
-    <w:p>
-      <w:pPr>
-        <w:rPr>
+    <w:p/>
+    <w:p>
+      <w:pPr>
+        <w:pStyle w:val="Ttulo1"/>
+        <w:spacing w:before="0" w:after="480" w:line="240" w:lineRule="auto"/>
+        <w:rPr>
+          <w:rFonts w:ascii="Arial Black" w:eastAsia="Times New Roman" w:hAnsi="Arial Black" w:cs="Times New Roman"/>
           <w:b/>
           <w:bCs/>
-        </w:rPr>
-      </w:pPr>
-      <w:r>
-        <w:rPr>
+          <w:caps/>
+          <w:color w:val="2C7FCE" w:themeColor="text2" w:themeTint="99"/>
+          <w:kern w:val="0"/>
+          <w:sz w:val="36"/>
+          <w:szCs w:val="28"/>
+          <w14:ligatures w14:val="none"/>
+        </w:rPr>
+      </w:pPr>
+      <w:r>
+        <w:rPr>
+          <w:rFonts w:ascii="Arial Black" w:eastAsia="Times New Roman" w:hAnsi="Arial Black" w:cs="Times New Roman"/>
           <w:b/>
           <w:bCs/>
+          <w:caps/>
+          <w:color w:val="2C7FCE" w:themeColor="text2" w:themeTint="99"/>
+          <w:kern w:val="0"/>
+          <w:sz w:val="36"/>
+          <w:szCs w:val="28"/>
+          <w14:ligatures w14:val="none"/>
         </w:rPr>
         <w:t>7. Conclusão</w:t>
       </w:r>
@@ -1997,6 +2357,16 @@
       <w:spacing w:val="5"/>
     </w:rPr>
   </w:style>
+  <w:style w:type="character" w:styleId="Forte">
+    <w:name w:val="Strong"/>
+    <w:uiPriority w:val="22"/>
+    <w:qFormat/>
+    <w:rsid w:val="005B6188"/>
+    <w:rPr>
+      <w:b/>
+      <w:bCs/>
+    </w:rPr>
+  </w:style>
 </w:styles>
 </file>
 

</xml_diff>

<commit_message>
Atualização final do README e relatórios
</commit_message>
<xml_diff>
--- a/relatório melhorias efolioA.docx
+++ b/relatório melhorias efolioA.docx
@@ -25,7 +25,7 @@
                     </pic:cNvPicPr>
                   </pic:nvPicPr>
                   <pic:blipFill>
-                    <a:blip r:embed="rId5"/>
+                    <a:blip r:embed="rId7"/>
                     <a:stretch>
                       <a:fillRect/>
                     </a:stretch>
@@ -92,7 +92,6 @@
     </w:p>
     <w:p>
       <w:pPr>
-        <w:spacing w:after="240" w:line="360" w:lineRule="auto"/>
         <w:rPr>
           <w:b/>
           <w:bCs/>
@@ -108,7 +107,6 @@
     </w:p>
     <w:p>
       <w:pPr>
-        <w:spacing w:after="240" w:line="360" w:lineRule="auto"/>
         <w:rPr>
           <w:b/>
           <w:bCs/>
@@ -123,11 +121,6 @@
       </w:r>
     </w:p>
     <w:p>
-      <w:pPr>
-        <w:rPr>
-          <w:rStyle w:val="Forte"/>
-        </w:rPr>
-      </w:pPr>
       <w:r>
         <w:rPr>
           <w:b/>
@@ -138,7 +131,6 @@
     </w:p>
     <w:p>
       <w:pPr>
-        <w:spacing w:after="240" w:line="360" w:lineRule="auto"/>
         <w:rPr>
           <w:b/>
           <w:bCs/>
@@ -154,7 +146,6 @@
     </w:p>
     <w:p>
       <w:pPr>
-        <w:spacing w:after="240" w:line="360" w:lineRule="auto"/>
         <w:rPr>
           <w:b/>
           <w:bCs/>
@@ -319,7 +310,7 @@
           <w:b/>
           <w:bCs/>
           <w:caps/>
-          <w:color w:val="2C7FCE" w:themeColor="text2" w:themeTint="99"/>
+          <w:color w:val="000000" w:themeColor="text1"/>
           <w:kern w:val="0"/>
           <w:sz w:val="36"/>
           <w:szCs w:val="28"/>
@@ -332,7 +323,7 @@
           <w:b/>
           <w:bCs/>
           <w:caps/>
-          <w:color w:val="2C7FCE" w:themeColor="text2" w:themeTint="99"/>
+          <w:color w:val="000000" w:themeColor="text1"/>
           <w:kern w:val="0"/>
           <w:sz w:val="36"/>
           <w:szCs w:val="28"/>
@@ -342,11 +333,17 @@
       </w:r>
     </w:p>
     <w:p>
+      <w:pPr>
+        <w:jc w:val="both"/>
+      </w:pPr>
       <w:r>
         <w:t>No âmbito da preparação do E-Fólio B, foi revista a implementação desenvolvida no E-Fólio A, tendo em consideração os comentários de avaliação recebidos. O objetivo desta revisão foi melhorar a robustez da análise léxica e sintática da linguagem MOCP, corrigindo limitações identificadas e preparando uma base mais sólida para as fases seguintes: ações semânticas, geração de código intermédio e otimização.</w:t>
       </w:r>
     </w:p>
     <w:p>
+      <w:pPr>
+        <w:jc w:val="both"/>
+      </w:pPr>
       <w:r>
         <w:t xml:space="preserve">O código selecionado para dar continuidade para as melhorias e consequentemente para o E-Fólio B foi </w:t>
       </w:r>
@@ -378,6 +375,7 @@
           <w:ilvl w:val="0"/>
           <w:numId w:val="4"/>
         </w:numPr>
+        <w:jc w:val="both"/>
       </w:pPr>
       <w:r>
         <w:t>A gramática e</w:t>
@@ -393,6 +391,7 @@
           <w:ilvl w:val="0"/>
           <w:numId w:val="4"/>
         </w:numPr>
+        <w:jc w:val="both"/>
       </w:pPr>
       <w:r>
         <w:t xml:space="preserve">A AST estava </w:t>
@@ -419,6 +418,7 @@
           <w:ilvl w:val="0"/>
           <w:numId w:val="4"/>
         </w:numPr>
+        <w:jc w:val="both"/>
       </w:pPr>
       <w:r>
         <w:t>Já tinha análise semântica</w:t>
@@ -437,6 +437,7 @@
           <w:ilvl w:val="0"/>
           <w:numId w:val="4"/>
         </w:numPr>
+        <w:jc w:val="both"/>
       </w:pPr>
       <w:proofErr w:type="gramStart"/>
       <w:r>
@@ -463,7 +464,7 @@
           <w:b/>
           <w:bCs/>
           <w:caps/>
-          <w:color w:val="2C7FCE" w:themeColor="text2" w:themeTint="99"/>
+          <w:color w:val="000000" w:themeColor="text1"/>
           <w:kern w:val="0"/>
           <w:sz w:val="36"/>
           <w:szCs w:val="28"/>
@@ -476,7 +477,7 @@
           <w:b/>
           <w:bCs/>
           <w:caps/>
-          <w:color w:val="2C7FCE" w:themeColor="text2" w:themeTint="99"/>
+          <w:color w:val="000000" w:themeColor="text1"/>
           <w:kern w:val="0"/>
           <w:sz w:val="36"/>
           <w:szCs w:val="28"/>
@@ -486,6 +487,9 @@
       </w:r>
     </w:p>
     <w:p>
+      <w:pPr>
+        <w:jc w:val="both"/>
+      </w:pPr>
       <w:r>
         <w:t xml:space="preserve">A primeira melhoria consistiu na introdução de uma regra “apanha-tudo” no </w:t>
       </w:r>
@@ -499,6 +503,9 @@
       </w:r>
     </w:p>
     <w:p>
+      <w:pPr>
+        <w:jc w:val="both"/>
+      </w:pPr>
       <w:r>
         <w:t>ERROR_</w:t>
       </w:r>
@@ -517,6 +524,9 @@
       <w:proofErr w:type="gramEnd"/>
     </w:p>
     <w:p>
+      <w:pPr>
+        <w:jc w:val="both"/>
+      </w:pPr>
       <w:r>
         <w:t>Esta regra permite capturar explicitamente caracteres inválidos ou inesperados que não correspondam a nenhuma regra lexical da linguagem. Com esta alteração, símbolos como @ passam a gerar mensagens controladas, por exemplo:</w:t>
       </w:r>
@@ -629,7 +639,7 @@
           <w:b/>
           <w:bCs/>
           <w:caps/>
-          <w:color w:val="2C7FCE" w:themeColor="text2" w:themeTint="99"/>
+          <w:color w:val="000000" w:themeColor="text1"/>
           <w:kern w:val="0"/>
           <w:sz w:val="36"/>
           <w:szCs w:val="28"/>
@@ -642,12 +652,13 @@
           <w:b/>
           <w:bCs/>
           <w:caps/>
-          <w:color w:val="2C7FCE" w:themeColor="text2" w:themeTint="99"/>
+          <w:color w:val="000000" w:themeColor="text1"/>
           <w:kern w:val="0"/>
           <w:sz w:val="36"/>
           <w:szCs w:val="28"/>
           <w14:ligatures w14:val="none"/>
         </w:rPr>
+        <w:lastRenderedPageBreak/>
         <w:t>3. Melhoria dos literais reais</w:t>
       </w:r>
     </w:p>
@@ -798,7 +809,7 @@
           <w:b/>
           <w:bCs/>
           <w:caps/>
-          <w:color w:val="2C7FCE" w:themeColor="text2" w:themeTint="99"/>
+          <w:color w:val="000000" w:themeColor="text1"/>
           <w:kern w:val="0"/>
           <w:sz w:val="36"/>
           <w:szCs w:val="28"/>
@@ -811,7 +822,7 @@
           <w:b/>
           <w:bCs/>
           <w:caps/>
-          <w:color w:val="2C7FCE" w:themeColor="text2" w:themeTint="99"/>
+          <w:color w:val="000000" w:themeColor="text1"/>
           <w:kern w:val="0"/>
           <w:sz w:val="36"/>
           <w:szCs w:val="28"/>
@@ -935,13 +946,19 @@
       <w:proofErr w:type="gramEnd"/>
     </w:p>
     <w:p>
+      <w:pPr>
+        <w:jc w:val="both"/>
+      </w:pPr>
+      <w:r>
+        <w:t>Esta modificação torna a gramática sintática mais flexível, permitindo testar ficheiros que contenham apenas protótipos ou declarações globais. A exigência de uma função principal continua a ser validada posteriormente na fase semântica.</w:t>
+      </w:r>
+    </w:p>
+    <w:p>
+      <w:pPr>
+        <w:jc w:val="both"/>
+      </w:pPr>
       <w:r>
         <w:lastRenderedPageBreak/>
-        <w:t>Esta modificação torna a gramática sintática mais flexível, permitindo testar ficheiros que contenham apenas protótipos ou declarações globais. A exigência de uma função principal continua a ser validada posteriormente na fase semântica.</w:t>
-      </w:r>
-    </w:p>
-    <w:p>
-      <w:r>
         <w:t>Deste modo, separa-se melhor:</w:t>
       </w:r>
     </w:p>
@@ -951,6 +968,7 @@
           <w:ilvl w:val="0"/>
           <w:numId w:val="1"/>
         </w:numPr>
+        <w:jc w:val="both"/>
       </w:pPr>
       <w:r>
         <w:t xml:space="preserve">a análise sintática, responsável por reconhecer estruturas gramaticais válidas; </w:t>
@@ -962,6 +980,7 @@
           <w:ilvl w:val="0"/>
           <w:numId w:val="1"/>
         </w:numPr>
+        <w:jc w:val="both"/>
       </w:pPr>
       <w:r>
         <w:t xml:space="preserve">a análise semântica, responsável por validar regras de programa completo e executável. </w:t>
@@ -976,7 +995,7 @@
           <w:b/>
           <w:bCs/>
           <w:caps/>
-          <w:color w:val="2C7FCE" w:themeColor="text2" w:themeTint="99"/>
+          <w:color w:val="000000" w:themeColor="text1"/>
           <w:kern w:val="0"/>
           <w:sz w:val="36"/>
           <w:szCs w:val="28"/>
@@ -989,7 +1008,7 @@
           <w:b/>
           <w:bCs/>
           <w:caps/>
-          <w:color w:val="2C7FCE" w:themeColor="text2" w:themeTint="99"/>
+          <w:color w:val="000000" w:themeColor="text1"/>
           <w:kern w:val="0"/>
           <w:sz w:val="36"/>
           <w:szCs w:val="28"/>
@@ -999,6 +1018,9 @@
       </w:r>
     </w:p>
     <w:p>
+      <w:pPr>
+        <w:jc w:val="both"/>
+      </w:pPr>
       <w:r>
         <w:t xml:space="preserve">O ficheiro error_handler.py foi atualizado para tratar os novos </w:t>
       </w:r>
@@ -1020,6 +1042,9 @@
       </w:r>
     </w:p>
     <w:p>
+      <w:pPr>
+        <w:jc w:val="both"/>
+      </w:pPr>
       <w:r>
         <w:t xml:space="preserve">Também foi mantida a deteção de palavras-chave da linguagem C original e operadores não suportados em MOCP, como </w:t>
       </w:r>
@@ -1066,7 +1091,7 @@
           <w:b/>
           <w:bCs/>
           <w:caps/>
-          <w:color w:val="2C7FCE" w:themeColor="text2" w:themeTint="99"/>
+          <w:color w:val="000000" w:themeColor="text1"/>
           <w:kern w:val="0"/>
           <w:sz w:val="36"/>
           <w:szCs w:val="28"/>
@@ -1079,7 +1104,7 @@
           <w:b/>
           <w:bCs/>
           <w:caps/>
-          <w:color w:val="2C7FCE" w:themeColor="text2" w:themeTint="99"/>
+          <w:color w:val="000000" w:themeColor="text1"/>
           <w:kern w:val="0"/>
           <w:sz w:val="36"/>
           <w:szCs w:val="28"/>
@@ -1178,7 +1203,7 @@
                     </pic:cNvPicPr>
                   </pic:nvPicPr>
                   <pic:blipFill>
-                    <a:blip r:embed="rId6"/>
+                    <a:blip r:embed="rId8"/>
                     <a:stretch>
                       <a:fillRect/>
                     </a:stretch>
@@ -1214,7 +1239,7 @@
           <w:b/>
           <w:bCs/>
           <w:caps/>
-          <w:color w:val="2C7FCE" w:themeColor="text2" w:themeTint="99"/>
+          <w:color w:val="000000" w:themeColor="text1"/>
           <w:kern w:val="0"/>
           <w:sz w:val="36"/>
           <w:szCs w:val="28"/>
@@ -1227,36 +1252,43 @@
           <w:b/>
           <w:bCs/>
           <w:caps/>
-          <w:color w:val="2C7FCE" w:themeColor="text2" w:themeTint="99"/>
+          <w:color w:val="000000" w:themeColor="text1"/>
           <w:kern w:val="0"/>
           <w:sz w:val="36"/>
           <w:szCs w:val="28"/>
           <w14:ligatures w14:val="none"/>
         </w:rPr>
+        <w:t>7. Conclusão</w:t>
+      </w:r>
+    </w:p>
+    <w:p>
+      <w:pPr>
+        <w:jc w:val="both"/>
+      </w:pPr>
+      <w:r>
+        <w:t xml:space="preserve">As alterações realizadas corrigem limitações identificadas no E-Fólio A e tornam a base do compilador MOCP mais robusta, clara e testável. Em particular, o </w:t>
+      </w:r>
+      <w:proofErr w:type="spellStart"/>
+      <w:r>
+        <w:t>lexer</w:t>
+      </w:r>
+      <w:proofErr w:type="spellEnd"/>
+      <w:r>
+        <w:t xml:space="preserve"> passou a produzir mensagens mais controladas, os literais reais passaram a aceitar formatos mais flexíveis e a regra principal do programa foi ajustada para separar melhor análise sintática e validação semântica.</w:t>
+      </w:r>
+    </w:p>
+    <w:p>
+      <w:pPr>
+        <w:jc w:val="both"/>
+      </w:pPr>
+      <w:r>
         <w:lastRenderedPageBreak/>
-        <w:t>7. Conclusão</w:t>
-      </w:r>
-    </w:p>
-    <w:p>
-      <w:r>
-        <w:t xml:space="preserve">As alterações realizadas corrigem limitações identificadas no E-Fólio A e tornam a base do compilador MOCP mais robusta, clara e testável. Em particular, o </w:t>
-      </w:r>
-      <w:proofErr w:type="spellStart"/>
-      <w:r>
-        <w:t>lexer</w:t>
-      </w:r>
-      <w:proofErr w:type="spellEnd"/>
-      <w:r>
-        <w:t xml:space="preserve"> passou a produzir mensagens mais controladas, os literais reais passaram a aceitar formatos mais flexíveis e a regra principal do programa foi ajustada para separar melhor análise sintática e validação semântica.</w:t>
-      </w:r>
-    </w:p>
-    <w:p>
-      <w:r>
         <w:t>Estas melhorias constituem uma base mais adequada para o desenvolvimento do E-Fólio B, nomeadamente para as fases de ações semânticas, geração de código intermédio e otimização.</w:t>
       </w:r>
     </w:p>
     <w:p/>
     <w:sectPr>
+      <w:footerReference w:type="default" r:id="rId9"/>
       <w:pgSz w:w="11906" w:h="16838"/>
       <w:pgMar w:top="1417" w:right="1701" w:bottom="1417" w:left="1701" w:header="0" w:footer="0" w:gutter="0"/>
       <w:cols w:space="720"/>
@@ -1265,6 +1297,98 @@
     </w:sectPr>
   </w:body>
 </w:document>
+</file>
+
+<file path=word/endnotes.xml><?xml version="1.0" encoding="utf-8"?>
+<w:endnotes xmlns:wpc="http://schemas.microsoft.com/office/word/2010/wordprocessingCanvas" xmlns:cx="http://schemas.microsoft.com/office/drawing/2014/chartex" xmlns:cx1="http://schemas.microsoft.com/office/drawing/2015/9/8/chartex" xmlns:cx2="http://schemas.microsoft.com/office/drawing/2015/10/21/chartex" xmlns:cx3="http://schemas.microsoft.com/office/drawing/2016/5/9/chartex" xmlns:cx4="http://schemas.microsoft.com/office/drawing/2016/5/10/chartex" xmlns:cx5="http://schemas.microsoft.com/office/drawing/2016/5/11/chartex" xmlns:cx6="http://schemas.microsoft.com/office/drawing/2016/5/12/chartex" xmlns:cx7="http://schemas.microsoft.com/office/drawing/2016/5/13/chartex" xmlns:cx8="http://schemas.microsoft.com/office/drawing/2016/5/14/chartex" xmlns:mc="http://schemas.openxmlformats.org/markup-compatibility/2006" xmlns:aink="http://schemas.microsoft.com/office/drawing/2016/ink" xmlns:am3d="http://schemas.microsoft.com/office/drawing/2017/model3d" xmlns:o="urn:schemas-microsoft-com:office:office" xmlns:oel="http://schemas.microsoft.com/office/2019/extlst" xmlns:r="http://schemas.openxmlformats.org/officeDocument/2006/relationships" xmlns:m="http://schemas.openxmlformats.org/officeDocument/2006/math" xmlns:v="urn:schemas-microsoft-com:vml" xmlns:wp14="http://schemas.microsoft.com/office/word/2010/wordprocessingDrawing" xmlns:wp="http://schemas.openxmlformats.org/drawingml/2006/wordprocessingDrawing" xmlns:w10="urn:schemas-microsoft-com:office:word" xmlns:w="http://schemas.openxmlformats.org/wordprocessingml/2006/main" xmlns:w14="http://schemas.microsoft.com/office/word/2010/wordml" xmlns:w15="http://schemas.microsoft.com/office/word/2012/wordml" xmlns:w16cex="http://schemas.microsoft.com/office/word/2018/wordml/cex" xmlns:w16cid="http://schemas.microsoft.com/office/word/2016/wordml/cid" xmlns:w16="http://schemas.microsoft.com/office/word/2018/wordml" xmlns:w16du="http://schemas.microsoft.com/office/word/2023/wordml/word16du" xmlns:w16sdtdh="http://schemas.microsoft.com/office/word/2020/wordml/sdtdatahash" xmlns:w16sdtfl="http://schemas.microsoft.com/office/word/2024/wordml/sdtformatlock" xmlns:w16se="http://schemas.microsoft.com/office/word/2015/wordml/symex" xmlns:wpg="http://schemas.microsoft.com/office/word/2010/wordprocessingGroup" xmlns:wpi="http://schemas.microsoft.com/office/word/2010/wordprocessingInk" xmlns:wne="http://schemas.microsoft.com/office/word/2006/wordml" xmlns:wps="http://schemas.microsoft.com/office/word/2010/wordprocessingShape" mc:Ignorable="w14 w15 w16se w16cid w16 w16cex w16sdtdh w16sdtfl w16du wp14">
+  <w:endnote w:type="separator" w:id="-1">
+    <w:p>
+      <w:pPr>
+        <w:spacing w:after="0" w:line="240" w:lineRule="auto"/>
+      </w:pPr>
+      <w:r>
+        <w:separator/>
+      </w:r>
+    </w:p>
+  </w:endnote>
+  <w:endnote w:type="continuationSeparator" w:id="0">
+    <w:p>
+      <w:pPr>
+        <w:spacing w:after="0" w:line="240" w:lineRule="auto"/>
+      </w:pPr>
+      <w:r>
+        <w:continuationSeparator/>
+      </w:r>
+    </w:p>
+  </w:endnote>
+</w:endnotes>
+</file>
+
+<file path=word/footer1.xml><?xml version="1.0" encoding="utf-8"?>
+<w:ftr xmlns:wpc="http://schemas.microsoft.com/office/word/2010/wordprocessingCanvas" xmlns:cx="http://schemas.microsoft.com/office/drawing/2014/chartex" xmlns:cx1="http://schemas.microsoft.com/office/drawing/2015/9/8/chartex" xmlns:cx2="http://schemas.microsoft.com/office/drawing/2015/10/21/chartex" xmlns:cx3="http://schemas.microsoft.com/office/drawing/2016/5/9/chartex" xmlns:cx4="http://schemas.microsoft.com/office/drawing/2016/5/10/chartex" xmlns:cx5="http://schemas.microsoft.com/office/drawing/2016/5/11/chartex" xmlns:cx6="http://schemas.microsoft.com/office/drawing/2016/5/12/chartex" xmlns:cx7="http://schemas.microsoft.com/office/drawing/2016/5/13/chartex" xmlns:cx8="http://schemas.microsoft.com/office/drawing/2016/5/14/chartex" xmlns:mc="http://schemas.openxmlformats.org/markup-compatibility/2006" xmlns:aink="http://schemas.microsoft.com/office/drawing/2016/ink" xmlns:am3d="http://schemas.microsoft.com/office/drawing/2017/model3d" xmlns:o="urn:schemas-microsoft-com:office:office" xmlns:oel="http://schemas.microsoft.com/office/2019/extlst" xmlns:r="http://schemas.openxmlformats.org/officeDocument/2006/relationships" xmlns:m="http://schemas.openxmlformats.org/officeDocument/2006/math" xmlns:v="urn:schemas-microsoft-com:vml" xmlns:wp14="http://schemas.microsoft.com/office/word/2010/wordprocessingDrawing" xmlns:wp="http://schemas.openxmlformats.org/drawingml/2006/wordprocessingDrawing" xmlns:w10="urn:schemas-microsoft-com:office:word" xmlns:w="http://schemas.openxmlformats.org/wordprocessingml/2006/main" xmlns:w14="http://schemas.microsoft.com/office/word/2010/wordml" xmlns:w15="http://schemas.microsoft.com/office/word/2012/wordml" xmlns:w16cex="http://schemas.microsoft.com/office/word/2018/wordml/cex" xmlns:w16cid="http://schemas.microsoft.com/office/word/2016/wordml/cid" xmlns:w16="http://schemas.microsoft.com/office/word/2018/wordml" xmlns:w16du="http://schemas.microsoft.com/office/word/2023/wordml/word16du" xmlns:w16sdtdh="http://schemas.microsoft.com/office/word/2020/wordml/sdtdatahash" xmlns:w16sdtfl="http://schemas.microsoft.com/office/word/2024/wordml/sdtformatlock" xmlns:w16se="http://schemas.microsoft.com/office/word/2015/wordml/symex" xmlns:wpg="http://schemas.microsoft.com/office/word/2010/wordprocessingGroup" xmlns:wpi="http://schemas.microsoft.com/office/word/2010/wordprocessingInk" xmlns:wne="http://schemas.microsoft.com/office/word/2006/wordml" xmlns:wps="http://schemas.microsoft.com/office/word/2010/wordprocessingShape" mc:Ignorable="w14 w15 w16se w16cid w16 w16cex w16sdtdh w16sdtfl w16du wp14">
+  <w:sdt>
+    <w:sdtPr>
+      <w:id w:val="135691692"/>
+      <w:docPartObj>
+        <w:docPartGallery w:val="Page Numbers (Bottom of Page)"/>
+        <w:docPartUnique/>
+      </w:docPartObj>
+    </w:sdtPr>
+    <w:sdtContent>
+      <w:p>
+        <w:pPr>
+          <w:pStyle w:val="Rodap"/>
+          <w:jc w:val="right"/>
+        </w:pPr>
+        <w:r>
+          <w:fldChar w:fldCharType="begin"/>
+        </w:r>
+        <w:r>
+          <w:instrText>PAGE   \* MERGEFORMAT</w:instrText>
+        </w:r>
+        <w:r>
+          <w:fldChar w:fldCharType="separate"/>
+        </w:r>
+        <w:r>
+          <w:t>2</w:t>
+        </w:r>
+        <w:r>
+          <w:fldChar w:fldCharType="end"/>
+        </w:r>
+      </w:p>
+    </w:sdtContent>
+  </w:sdt>
+  <w:p>
+    <w:pPr>
+      <w:pStyle w:val="Rodap"/>
+    </w:pPr>
+  </w:p>
+</w:ftr>
+</file>
+
+<file path=word/footnotes.xml><?xml version="1.0" encoding="utf-8"?>
+<w:footnotes xmlns:wpc="http://schemas.microsoft.com/office/word/2010/wordprocessingCanvas" xmlns:cx="http://schemas.microsoft.com/office/drawing/2014/chartex" xmlns:cx1="http://schemas.microsoft.com/office/drawing/2015/9/8/chartex" xmlns:cx2="http://schemas.microsoft.com/office/drawing/2015/10/21/chartex" xmlns:cx3="http://schemas.microsoft.com/office/drawing/2016/5/9/chartex" xmlns:cx4="http://schemas.microsoft.com/office/drawing/2016/5/10/chartex" xmlns:cx5="http://schemas.microsoft.com/office/drawing/2016/5/11/chartex" xmlns:cx6="http://schemas.microsoft.com/office/drawing/2016/5/12/chartex" xmlns:cx7="http://schemas.microsoft.com/office/drawing/2016/5/13/chartex" xmlns:cx8="http://schemas.microsoft.com/office/drawing/2016/5/14/chartex" xmlns:mc="http://schemas.openxmlformats.org/markup-compatibility/2006" xmlns:aink="http://schemas.microsoft.com/office/drawing/2016/ink" xmlns:am3d="http://schemas.microsoft.com/office/drawing/2017/model3d" xmlns:o="urn:schemas-microsoft-com:office:office" xmlns:oel="http://schemas.microsoft.com/office/2019/extlst" xmlns:r="http://schemas.openxmlformats.org/officeDocument/2006/relationships" xmlns:m="http://schemas.openxmlformats.org/officeDocument/2006/math" xmlns:v="urn:schemas-microsoft-com:vml" xmlns:wp14="http://schemas.microsoft.com/office/word/2010/wordprocessingDrawing" xmlns:wp="http://schemas.openxmlformats.org/drawingml/2006/wordprocessingDrawing" xmlns:w10="urn:schemas-microsoft-com:office:word" xmlns:w="http://schemas.openxmlformats.org/wordprocessingml/2006/main" xmlns:w14="http://schemas.microsoft.com/office/word/2010/wordml" xmlns:w15="http://schemas.microsoft.com/office/word/2012/wordml" xmlns:w16cex="http://schemas.microsoft.com/office/word/2018/wordml/cex" xmlns:w16cid="http://schemas.microsoft.com/office/word/2016/wordml/cid" xmlns:w16="http://schemas.microsoft.com/office/word/2018/wordml" xmlns:w16du="http://schemas.microsoft.com/office/word/2023/wordml/word16du" xmlns:w16sdtdh="http://schemas.microsoft.com/office/word/2020/wordml/sdtdatahash" xmlns:w16sdtfl="http://schemas.microsoft.com/office/word/2024/wordml/sdtformatlock" xmlns:w16se="http://schemas.microsoft.com/office/word/2015/wordml/symex" xmlns:wpg="http://schemas.microsoft.com/office/word/2010/wordprocessingGroup" xmlns:wpi="http://schemas.microsoft.com/office/word/2010/wordprocessingInk" xmlns:wne="http://schemas.microsoft.com/office/word/2006/wordml" xmlns:wps="http://schemas.microsoft.com/office/word/2010/wordprocessingShape" mc:Ignorable="w14 w15 w16se w16cid w16 w16cex w16sdtdh w16sdtfl w16du wp14">
+  <w:footnote w:type="separator" w:id="-1">
+    <w:p>
+      <w:pPr>
+        <w:spacing w:after="0" w:line="240" w:lineRule="auto"/>
+      </w:pPr>
+      <w:r>
+        <w:separator/>
+      </w:r>
+    </w:p>
+  </w:footnote>
+  <w:footnote w:type="continuationSeparator" w:id="0">
+    <w:p>
+      <w:pPr>
+        <w:spacing w:after="0" w:line="240" w:lineRule="auto"/>
+      </w:pPr>
+      <w:r>
+        <w:continuationSeparator/>
+      </w:r>
+    </w:p>
+  </w:footnote>
+</w:footnotes>
 </file>
 
 <file path=word/numbering.xml><?xml version="1.0" encoding="utf-8"?>
@@ -2810,6 +2934,50 @@
       <w:color w:val="0F4761" w:themeColor="accent1" w:themeShade="BF"/>
     </w:rPr>
   </w:style>
+  <w:style w:type="paragraph" w:styleId="Cabealho">
+    <w:name w:val="header"/>
+    <w:basedOn w:val="Normal"/>
+    <w:link w:val="CabealhoCarter"/>
+    <w:uiPriority w:val="99"/>
+    <w:unhideWhenUsed/>
+    <w:rsid w:val="00AD2D8B"/>
+    <w:pPr>
+      <w:tabs>
+        <w:tab w:val="center" w:pos="4252"/>
+        <w:tab w:val="right" w:pos="8504"/>
+      </w:tabs>
+      <w:spacing w:after="0" w:line="240" w:lineRule="auto"/>
+    </w:pPr>
+  </w:style>
+  <w:style w:type="character" w:customStyle="1" w:styleId="CabealhoCarter">
+    <w:name w:val="Cabeçalho Caráter"/>
+    <w:basedOn w:val="Tipodeletrapredefinidodopargrafo"/>
+    <w:link w:val="Cabealho"/>
+    <w:uiPriority w:val="99"/>
+    <w:rsid w:val="00AD2D8B"/>
+  </w:style>
+  <w:style w:type="paragraph" w:styleId="Rodap">
+    <w:name w:val="footer"/>
+    <w:basedOn w:val="Normal"/>
+    <w:link w:val="RodapCarter"/>
+    <w:uiPriority w:val="99"/>
+    <w:unhideWhenUsed/>
+    <w:rsid w:val="00AD2D8B"/>
+    <w:pPr>
+      <w:tabs>
+        <w:tab w:val="center" w:pos="4252"/>
+        <w:tab w:val="right" w:pos="8504"/>
+      </w:tabs>
+      <w:spacing w:after="0" w:line="240" w:lineRule="auto"/>
+    </w:pPr>
+  </w:style>
+  <w:style w:type="character" w:customStyle="1" w:styleId="RodapCarter">
+    <w:name w:val="Rodapé Caráter"/>
+    <w:basedOn w:val="Tipodeletrapredefinidodopargrafo"/>
+    <w:link w:val="Rodap"/>
+    <w:uiPriority w:val="99"/>
+    <w:rsid w:val="00AD2D8B"/>
+  </w:style>
 </w:styles>
 </file>
 

</xml_diff>